<commit_message>
Update latest desktop version
</commit_message>
<xml_diff>
--- a/Latex_Abstract/main_abstract.docx
+++ b/Latex_Abstract/main_abstract.docx
@@ -12,7 +12,7 @@
           <w:b/>
           <w:sz w:val="28"/>
         </w:rPr>
-        <w:t>Device-Guided Calibration of the Stanford RRAM Model: Generalization, Identifiability, and Deposition Trends in Sputter-Deposited TaO$_x$ Devices</w:t>
+        <w:t>Device-Guided Calibration of the Stanford RRAM Model: Generalization, Identifiability, and Deposition Trends in Sputter-Deposited TaOₓ Devices</w:t>
       </w:r>
     </w:p>
     <w:p>
@@ -73,7 +73,7 @@
         <w:jc w:val="both"/>
       </w:pPr>
       <w:r>
-        <w:t>Before any fitting, each resistance-state segment of the representative loop is classified as ohmic, Poole–Frenkel, Schottky, or Fowler–Nordheim conduction (Fig. 1). Because some of these signatures look almost identical over a short voltage span, we add a physical sanity check: the measured slope is converted into an effective dielectric constant, and a label is accepted only if that value is physically reasonable for the 7-nm oxide. The model itself — the Stanford Verilog-A description — is then simulated in HSPICE, and its parameters are tuned to match the measured loop on a logarithmic current scale (the sweep spans several decades of current, so a log scale gives all of them fair weight). The search uses Bayesian optimization, a guided search that learns from each trial which parameter values to try next, so it reaches a good fit in a few hundred simulations instead of scanning a grid, followed by a short local polish. Importantly, the parts of the curve the Stanford law cannot represent (the Schottky/FN regions) are down-weighted during fitting so they cannot distort the parameters the model can represent, but they are restored to full weight when we report the final error so the mismatch stays visible.</w:t>
+        <w:t>Before any fitting, each resistance-state segment of the representative loop is classified as ohmic, Poole–Frenkel, Schottky, or Fowler–Nordheim conduction (Fig. 1). The four candidates are fit to the same common log-current response so their information criteria are directly comparable, a window is flagged ‘ambiguous’ when the best two candidates are statistically close, and the implied dielectric constant is used only to reject physically nonphysical interface fits — never to confirm a mechanism — so the labels are a model-adequacy diagnostic rather than proof of a microscopic mechanism. The model itself — the Stanford Verilog-A description — is then simulated in HSPICE, and its parameters are tuned to match the measured loop on a logarithmic current scale (the sweep spans several decades of current, so a log scale gives all of them fair weight). The search uses Bayesian optimization, a guided search that learns from each trial which parameter values to try next, so it reaches a good fit in a few hundred simulations instead of scanning a grid, followed by a short local polish. Importantly, the parts of the curve the Stanford law cannot represent (the Schottky/FN regions) are down-weighted during fitting so they cannot distort the parameters the model can represent, but they are restored to full weight when we report the final error so the mismatch stays visible.</w:t>
       </w:r>
     </w:p>
     <w:p>
@@ -82,7 +82,7 @@
         <w:jc w:val="both"/>
       </w:pPr>
       <w:r>
-        <w:t>Across all twelve conditions the fits reproduce the measured butterfly curves with a typical error of 0.530 current decades for SET and 0.761 for RESET (Table II). (“Error” here is the root-mean-square gap between simulated and measured current along the sweep; one decade is a factor of ten, so 0.5 decade means the simulated current is typically within about a factor of three of the measurement.) The fits capture the hysteresis order, both switching transitions, the compliance plateau, and the LRS return branch. The leftover error is not random scatter: a simple residual test — the Durbin–Watson statistic, which detects whether the error drifts smoothly along the sweep rather than jittering point to point — shows it is systematic. That is the signature of a missing physical term, not of optimizer failure, and the regime map tells us which term: the high-resistance state (HRS) is interface-limited Schottky conduction in 92.5–100% of cycles for every condition (Fig. 2), a mechanism the Stanford bulk current law does not contain. A controlled ablation (Table III) makes the same point from the optimization side: removing the search nearly triples the RESET error, yet the three optimized variants land within a few hundredths of a decade of each other, so a low overlay error by itself cannot single out the right physics.</w:t>
+        <w:t>Across all twelve conditions the fits reproduce the measured butterfly curves with a typical error of 0.530 current decades for SET and 0.761 for RESET (Table II). (“Error” here is the root-mean-square gap between simulated and measured current along the sweep; one decade is a factor of ten, so 0.5 decade means the simulated current is typically within about a factor of three of the measurement.) The fits capture the hysteresis order, both switching transitions, the compliance plateau, and the LRS return branch. The leftover error is not random scatter: a simple residual test — the Durbin–Watson statistic, which detects whether the error drifts smoothly along the sweep rather than jittering point to point — shows it is systematic. That is the signature of a missing physical term, not of optimizer failure, and the regime map points to the likely term: the high-resistance state (HRS) is barrier-limited (Schottky-like where a credible window is present), a mechanism the Stanford bulk current law does not contain, although room-temperature DC data cannot cleanly separate it from a near-ohmic trend (Fig. 2). A controlled ablation (Table III) makes the same point from the optimization side: removing the search nearly triples the RESET error, yet the three optimized variants land within a few hundredths of a decade of each other, so a low overlay error by itself cannot single out the right physics.</w:t>
       </w:r>
     </w:p>
     <w:p>
@@ -91,7 +91,7 @@
         <w:jc w:val="both"/>
       </w:pPr>
       <w:r>
-        <w:t>The most important check is whether a fit made on one cycle describes the cycles it never saw. We score the fitted curve, point by point, against every measured cycle of the device. Averaged over conditions, this held-out error is 0.542 (SET) and 0.800 (RESET) decades, versus the in-sample 0.530 and 0.761 — a gap of only about 0.01–0.04 decade (Fig. 3). For every condition the fitted-cycle value sits inside the spread of the held-out cycles, and the fitted S1 curve stays within the measured cycle-to-cycle envelope along almost the entire sweep, departing only at the SET transition and the Schottky-limited HRS approach (Fig. 4). In other words, the representative cycle is simply the most central member of a population the model reproduces uniformly: the calibration is a property of the device, not an artifact of which loop we happened to fit.</w:t>
+        <w:t>The most important check is whether a fit made on one cycle describes data it never saw. We first score the fitted curve against every other measured cycle of the same device: averaged over conditions this held-out error is 0.542 (SET) and 0.800 (RESET) decades, versus the in-sample 0.530 and 0.761 — a small average gap (Fig. 3), though the per-condition agreement varies and S1 RESET is a flagged outlier, so we report the distribution rather than claiming the two are indistinguishable. The fitted S1 curve stays within the measured cycle-to-cycle envelope along almost the entire sweep, departing only at the SET transition and the HRS approach (Fig. 4). The stronger test is split-safe population validation: over the full population (545 device records, ~10,900 cycles) we form leakage-free device-level splits and score the medoid-fitted model against cycles of entirely unseen devices. The unseen-device median error (0.580 SET, 0.861 RESET) exceeds the same-device value by only ~0.04–0.06 decade, genuine population-scale evidence that the calibration is a property of the device population, not an artifact of which loop we fitted (Fig. 11).</w:t>
       </w:r>
     </w:p>
     <w:p>
@@ -100,7 +100,7 @@
         <w:jc w:val="both"/>
       </w:pPr>
       <w:r>
-        <w:t>A fit that generalizes can still hide parameters that the data do not actually determine. To find them we resample the measurement: we repeatedly draw random subsets of the measured cycles, refit each time, and watch how much each parameter moves — a procedure called the bootstrap. We report each parameter as the bootstrap median with a percentile interval, so the quoted value always sits inside its own error bar, and we flag any parameter whose error bar is set by the prior search box rather than by the data. The branch voltage scales are the most repeatable coordinates (CV ≈ 0.28), consistent with the curvature of the switching branch directly fixing them. In contrast, series resistance is the extreme case of a box-limited parameter: every single bootstrap refit rails against the edge of the search box (100% pinned), so its one-to-two-decade interval reflects the box, not the device (Fig. 5). A purely local sensitivity calculation (a Fisher analysis; Fig. 6) can be misleading here: it makes series resistance look well determined at a single fit, yet that same parameter wanders the most under resampling. Decomposing the Fisher information into its natural directions makes the situation precise (Fig. 9): the sensitivity spectrum spans on average about 37 orders of magnitude, with a single dominant well-determined direction — a textbook ‘sloppy’ model. The honest conclusion is that DC butterfly data constrain one or two effective combinations far better than they constrain a unique split into current prefactor, gap size, activation energy, and kinetic prefactor.</w:t>
+        <w:t>A fit that generalizes can still hide parameters that the data do not actually determine. To find them we resample the measurement: we repeatedly draw random subsets of the measured cycles, refit each time, and watch how much each parameter moves — a procedure called the bootstrap. We report each parameter as the bootstrap median with a percentile interval, so the quoted value always sits inside its own error bar, and we flag any parameter whose error bar is set by the prior search box rather than by the data. The branch voltage scales are the most repeatable coordinates (CV ≈ 0.28), consistent with the curvature of the switching branch directly fixing them. In contrast, series resistance is the extreme case of a box-limited parameter: every single bootstrap refit rails against the edge of the search box (100% pinned), so its one-to-two-decade interval reflects the box, not the device (Fig. 5). A purely local sensitivity calculation (a Fisher analysis; Fig. 6) can be misleading here: it makes series resistance look well determined at a single fit, yet that same parameter wanders the most under resampling. Decomposing the Fisher information into its natural directions makes the situation precise (Fig. 9): the matrix is rank deficient (numerical rank roughly 8–14 of 16 directions), with a few stiff well-determined directions and many sloppy ones — a textbook ‘sloppy’ model. We report this rank rather than an exact eigenvalue span, because eigenvalues far below the largest are double-precision noise, not measurable information. The honest conclusion is that DC butterfly data constrain one or two effective combinations far better than they constrain a unique split into current prefactor, gap size, activation energy, and kinetic prefactor.</w:t>
       </w:r>
     </w:p>
     <w:p>
@@ -109,7 +109,7 @@
         <w:jc w:val="both"/>
       </w:pPr>
       <w:r>
-        <w:t>This directly tells a process engineer which extracted numbers may be plotted against deposition — and we test the trends formally rather than by eye. Because the deposition design is a face-centered factorial with four repeated center points, we fit a response surface to each admissible parameter and use the repeats as a built-in noise estimate (a lack-of-fit test). Only the SET voltage scale passes: it rises with oxygen and falls with power, both statistically significant, with no significant lack-of-fit (Fig. 7). The RESET voltage scale shows the same oxygen sign but does not reach significance, and series resistance shows no significant trend at all — so, of the whole Stanford parameter table, exactly one column is currently a defensible process response. The four repeated center-point devices also let us separate cycle-to-cycle from device-to-device scatter: for every parameter the cycle-to-cycle spread is the larger of the two (Fig. 10), so the cycle bootstrap captures the dominant uncertainty and the device-to-device differences are mostly cycling, not fabrication. Finally, the regime classifier yields a process-facing observable that is not a fitting knob at all: the effective dielectric constant of the post-RESET Schottky barrier, now measured on every cycle. Its per-condition median lands between about 5 and 25 — physically reasonable — for all twelve conditions, each with a cycle-bootstrap error bar (Fig. 8), confirming interface-limited Schottky emission across the entire process window. Crucially this observable stays meaningful exactly where the compact-model parameters do not, because it is read from the data, not fitted.</w:t>
+        <w:t>This directly tells a process engineer which extracted numbers may be plotted against deposition — and we test the trends formally rather than by eye. Because the deposition design is a face-centered factorial with four repeated center points, we fit a response surface to each admissible parameter and use the repeats as a built-in noise estimate (a lack-of-fit test). Only the SET voltage scale passes: it rises with oxygen and falls with power, both statistically significant, with no significant lack-of-fit (Fig. 7). The RESET voltage scale shows the same oxygen sign but does not reach significance, and series resistance shows no significant trend at all — so, of the whole Stanford parameter table, exactly one column is currently a defensible process response. The four repeated center-point devices also let us separate cycle-to-cycle from device-to-device scatter: for every parameter the cycle-to-cycle spread is the larger of the two (Fig. 10), so the cycle bootstrap captures the dominant uncertainty and the device-to-device differences are mostly cycling, not fabrication. Finally, the regime classifier yields a process-facing observable that is not a fitting knob at all: the effective dielectric constant of the post-RESET Schottky-like window, measured on every cycle where such a window is credible. Its per-condition median lands between about 5 and 23 — physically reasonable — in the ten conditions that show the window, each with a cycle-bootstrap error bar (Fig. 8), supporting barrier-limited HRS conduction where it is observed. Crucially this observable stays meaningful exactly where the compact-model parameters do not, because it is read from the data, not fitted.</w:t>
       </w:r>
     </w:p>
     <w:p>
@@ -124,7 +124,7 @@
         <w:t xml:space="preserve">In summary, </w:t>
       </w:r>
       <w:r>
-        <w:t>for sputter-deposited TaOₓ the Stanford compact model can be calibrated to within about half a current decade, and — more importantly — that calibration generalizes from one representative cycle to the full measured-cycle population of the device. But the fitted parameter table must not be read uniformly: the parameterization is profoundly sloppy, and of all its columns only the SET voltage scale passes a formal deposition-trend test, while series resistance, velocity prefactors, activation energies, and gap geometry behave as numerical fitting knobs rather than process outputs from DC sweeps alone. The same analysis pinpoints the model's physical limitation — the post-RESET HRS is Schottky-limited in nearly every cycle of every condition, a mechanism the Stanford bulk current law lacks. The practical recommendation is therefore to report an RRAM compact-model calibration as four items together — fit quality, cycle-to-cycle generalization, parameter identifiability, and conduction-mechanism validity — rather than a single overlay plot, so a reader can tell which extracted numbers are measurements of the device and which are merely well-fitting knobs.</w:t>
+        <w:t>for sputter-deposited TaOₓ the Stanford compact model can be calibrated to within about half a current decade, and — more importantly — that calibration generalizes not only across the cycles of the fitted device but to entirely unseen devices in a split-safe population test. But the fitted parameter table must not be read uniformly: the parameterization is rank deficient (profoundly sloppy), and of all its columns only the SET voltage scale passes a formal deposition-trend test, while series resistance (fully bound-pinned), velocity prefactors, activation energies, and gap geometry behave as numerical fitting knobs rather than process outputs from DC sweeps alone. The same analysis points to the model's physical limitation — the post-RESET HRS is barrier-limited (Schottky-like where credible), a mechanism the Stanford bulk current law lacks, though room-temperature DC data cannot confirm a single microscopic mechanism. The practical recommendation is therefore to report an RRAM compact-model calibration as four items together — fit quality, population-level generalization, parameter identifiability, and conduction-mechanism validity — rather than a single overlay plot, so a reader can tell which extracted numbers are measurements of the device and which are merely well-fitting knobs.</w:t>
       </w:r>
     </w:p>
     <w:p>
@@ -2240,7 +2240,7 @@
                 <w:i/>
                 <w:sz w:val="16"/>
               </w:rPr>
-              <w:t xml:space="preserve"> Conduction-regime classification of the four resistance-state segments of a representative S1 cycle. The two low-resistance (LRS) segments are ohmic (R²≥0.98); the two high-resistance (HRS) segments are Schottky-limited, with a Fowler–Nordheim window near the SET transition. This map tells the fitter where the Stanford bulk current law can and cannot follow the data.</w:t>
+              <w:t xml:space="preserve"> Conduction-regime classification (common-response fit) of the four resistance-state segments of a representative S1 cycle. The two low-resistance (LRS) segments are ohmic (R²≥0.98); the two high-resistance (HRS) segments are barrier-limited, with a Schottky-like window where the implied permittivity is admissible. This map tells the fitter where the Stanford bulk current law can and cannot follow the data.</w:t>
             </w:r>
           </w:p>
         </w:tc>
@@ -2306,7 +2306,7 @@
                 <w:i/>
                 <w:sz w:val="16"/>
               </w:rPr>
-              <w:t xml:space="preserve"> Dominant conduction mechanism and its cycle-to-cycle stability for every resistance-state segment and all twelve conditions. The post-SET LRS is consistently ohmic; the post-RESET HRS is Schottky-dominant in 92.5–100% of cycles everywhere.</w:t>
+              <w:t xml:space="preserve"> Dominant conduction mechanism and its cycle-to-cycle stability for every resistance-state segment and all twelve conditions. The post-SET LRS is consistently ohmic; the high-resistance segments are barrier-limited but not cleanly separable, with a robust Schottky-like signature at higher voltage and many windows flagged ambiguous.</w:t>
             </w:r>
           </w:p>
         </w:tc>
@@ -2574,7 +2574,7 @@
                 <w:i/>
                 <w:sz w:val="16"/>
               </w:rPr>
-              <w:t xml:space="preserve"> Local Fisher (one-point sensitivity) relative uncertainty for the 16 active parameters across the twelve conditions, shown only as a cross-check. The extreme condition numbers (10¹⁸–10⁶⁶) prevent certifying individual parameters from this map alone; conclusions are drawn only where it agrees with Fig. 5.</w:t>
+              <w:t xml:space="preserve"> Fisher relative (log-coordinate) uncertainty for the 16 active parameters across the twelve conditions, shown only as a cross-check. The Fisher matrix is rank deficient (numerical rank ≈8–14/16), so individual parameters are not certified from this map alone; conclusions are drawn only where it agrees with Fig. 5.</w:t>
             </w:r>
           </w:p>
         </w:tc>
@@ -2708,7 +2708,7 @@
                 <w:i/>
                 <w:sz w:val="16"/>
               </w:rPr>
-              <w:t xml:space="preserve"> Effective dielectric constant of the post-RESET Schottky window, now measured on every cycle and shown as the per-condition median with a cycle-bootstrap 95% interval. The shaded band is the physically admissible range; all twelve medians fall inside it, confirming interface-limited HRS conduction across the entire process window.</w:t>
+              <w:t xml:space="preserve"> Effective dielectric constant of the post-RESET Schottky-like window, measured on every cycle where the window is credible, shown as the per-condition median with a cycle-bootstrap 95% interval. The shaded band is the physically admissible range; the ten conditions with such a window fall inside it, supporting barrier-limited HRS conduction where it is observed.</w:t>
             </w:r>
           </w:p>
         </w:tc>
@@ -2776,7 +2776,7 @@
                 <w:i/>
                 <w:sz w:val="16"/>
               </w:rPr>
-              <w:t xml:space="preserve"> Sloppiness of the Stanford parameterization. Left: normalized sensitivity (Fisher eigenvalue) spectra for all twelve conditions, falling over tens of decades. Right: how much each parameter participates in the single best-determined direction — a coupled current-scale/gap combination, not any one microscopic parameter.</w:t>
+              <w:t xml:space="preserve"> Sloppiness of the Stanford parameterization. Left: normalized Fisher eigenvalue spectra for all twelve conditions; the matrix is rank deficient (a few stiff directions, many sloppy ones below the numerical floor). Right: how much each parameter participates in the single best-determined direction — a coupled current-scale/gap combination, not any one microscopic parameter.</w:t>
             </w:r>
           </w:p>
         </w:tc>
@@ -2845,6 +2845,80 @@
               <w:t xml:space="preserve"> Cycle-to-cycle vs. device-to-device spread from the four repeated center-point devices (S9–S12). For every parameter the cycle-to-cycle spread dominates, so the scatter among nominally identical devices is mostly cycling, not fabrication.</w:t>
             </w:r>
           </w:p>
+        </w:tc>
+      </w:tr>
+      <w:tr>
+        <w:tc>
+          <w:tcPr>
+            <w:tcW w:type="dxa" w:w="4968"/>
+          </w:tcPr>
+          <w:p>
+            <w:pPr>
+              <w:spacing w:after="40"/>
+              <w:jc w:val="center"/>
+            </w:pPr>
+            <w:r>
+              <w:drawing>
+                <wp:inline xmlns:a="http://schemas.openxmlformats.org/drawingml/2006/main" xmlns:pic="http://schemas.openxmlformats.org/drawingml/2006/picture">
+                  <wp:extent cx="2651760" cy="1218376"/>
+                  <wp:docPr id="11" name="Picture 11"/>
+                  <wp:cNvGraphicFramePr>
+                    <a:graphicFrameLocks noChangeAspect="1"/>
+                  </wp:cNvGraphicFramePr>
+                  <a:graphic>
+                    <a:graphicData uri="http://schemas.openxmlformats.org/drawingml/2006/picture">
+                      <pic:pic>
+                        <pic:nvPicPr>
+                          <pic:cNvPr id="0" name="unseen_device_validation.png"/>
+                          <pic:cNvPicPr/>
+                        </pic:nvPicPr>
+                        <pic:blipFill>
+                          <a:blip r:embed="rId19"/>
+                          <a:stretch>
+                            <a:fillRect/>
+                          </a:stretch>
+                        </pic:blipFill>
+                        <pic:spPr>
+                          <a:xfrm>
+                            <a:off x="0" y="0"/>
+                            <a:ext cx="2651760" cy="1218376"/>
+                          </a:xfrm>
+                          <a:prstGeom prst="rect"/>
+                        </pic:spPr>
+                      </pic:pic>
+                    </a:graphicData>
+                  </a:graphic>
+                </wp:inline>
+              </w:drawing>
+            </w:r>
+          </w:p>
+          <w:p>
+            <w:pPr>
+              <w:spacing w:after="160"/>
+              <w:jc w:val="left"/>
+            </w:pPr>
+            <w:r>
+              <w:rPr>
+                <w:b/>
+                <w:i/>
+                <w:sz w:val="16"/>
+              </w:rPr>
+              <w:t>Fig. 11.</w:t>
+            </w:r>
+            <w:r>
+              <w:rPr>
+                <w:i/>
+                <w:sz w:val="16"/>
+              </w:rPr>
+              <w:t xml:space="preserve"> Split-safe unseen-device validation. Box plots: per-cycle error when the medoid-fitted model is scored against cycles of held-out devices never used for selection or fitting (leakage-free device-level splits over 545 device records); stars mark the same-device held-out median. The model generalizes to unseen devices with only a modest median increase.</w:t>
+            </w:r>
+          </w:p>
+        </w:tc>
+        <w:tc>
+          <w:tcPr>
+            <w:tcW w:type="dxa" w:w="4968"/>
+          </w:tcPr>
+          <w:p/>
         </w:tc>
       </w:tr>
     </w:tbl>

</xml_diff>